<commit_message>
Countersigned DPA copies require an annual Enterprise plan
Co-Authored-By: Claude Fable 5.1 <noreply@anthropic.com>
Claude-Session: https://claude.ai/code/session_01VcJLUQKL3xLTeXKqUFNFW9
</commit_message>
<xml_diff>
--- a/public/legal/RevenueHunt-Information-Security-Policy.docx
+++ b/public/legal/RevenueHunt-Information-Security-Policy.docx
@@ -16,7 +16,7 @@
         <w:pStyle w:val="FirstParagraph"/>
       </w:pPr>
       <w:r>
-        <w:t xml:space="preserve">Last updated: July 13, 2026.</w:t>
+        <w:t xml:space="preserve">Last updated: September 10, 2026.</w:t>
       </w:r>
     </w:p>
     <w:p>
@@ -1008,7 +1008,7 @@
         <w:t xml:space="preserve"> </w:t>
       </w:r>
       <w:r>
-        <w:t xml:space="preserve">is published in full and binds both parties in electronic form. A countersigned copy is available to merchants on an Enterprise plan.</w:t>
+        <w:t xml:space="preserve">is published in full and binds both parties in electronic form. A countersigned copy is available to merchants on an annual Enterprise plan.</w:t>
       </w:r>
     </w:p>
     <w:bookmarkEnd w:id="32"/>

</xml_diff>

<commit_message>
Security/DPA: stop implying SOC 2 certification
Security page listed "SOC documentation" among things you can request and
DPA 10.2(b) cited SOC 2 as an example of our audit reports. A prospect read
that as a certification claim. State plainly that we hold no SOC 2 or
ISO 27001, and regenerate the DOCX/CSV/PDF downloads.

Co-Authored-By: Claude Opus 5.5 <noreply@anthropic.com>
</commit_message>
<xml_diff>
--- a/public/legal/RevenueHunt-Information-Security-Policy.docx
+++ b/public/legal/RevenueHunt-Information-Security-Policy.docx
@@ -16,7 +16,7 @@
         <w:pStyle w:val="FirstParagraph"/>
       </w:pPr>
       <w:r>
-        <w:t xml:space="preserve">Last updated: September 10, 2026.</w:t>
+        <w:t xml:space="preserve">Last updated: October 29, 2026.</w:t>
       </w:r>
     </w:p>
     <w:p>
@@ -133,7 +133,7 @@
           <w:rPr>
             <w:rStyle w:val="Hyperlink"/>
           </w:rPr>
-          <w:t xml:space="preserve">security@revenuehunt.com</w:t>
+          <w:t xml:space="preserve">info@revenuehunt.com</w:t>
         </w:r>
       </w:hyperlink>
     </w:p>
@@ -1026,7 +1026,7 @@
         <w:pStyle w:val="FirstParagraph"/>
       </w:pPr>
       <w:r>
-        <w:t xml:space="preserve">For security questions that are not vulnerability reports - for example, requests for our security questionnaire, DPA, or SOC documentation - please email</w:t>
+        <w:t xml:space="preserve">For security questions that are not vulnerability reports - for example, requests for our DPA or a completed security questionnaire - please email</w:t>
       </w:r>
       <w:r>
         <w:t xml:space="preserve"> </w:t>
@@ -1036,7 +1036,7 @@
           <w:rPr>
             <w:rStyle w:val="Hyperlink"/>
           </w:rPr>
-          <w:t xml:space="preserve">security@revenuehunt.com</w:t>
+          <w:t xml:space="preserve">info@revenuehunt.com</w:t>
         </w:r>
       </w:hyperlink>
       <w:r>

</xml_diff>